<commit_message>
Adiciona caixa de nome do paciente e aba de locais de atendimento
- Gerar documento: o nome do paciente é digitado direto; se já houver
  cadastro, os dados são preenchidos (com sugestões enquanto digita); se
  for novo, o cadastro é criado ao gerar, com o que foi digitado
- Nova aba Locais de atendimento, com campos {{LOCAL}}, {{LOCAL_ENDERECO}},
  {{CIDADE}}, {{LOCAL_TELEFONE}}, {{LOCAL_EMAIL}} e {{CNPJ}}
- Último modelo e local escolhidos ficam lembrados
- Dados salvos por versões anteriores continuam sendo lidos

Co-Authored-By: Claude Opus 5.5 <noreply@anthropic.com>
Claude-Session: https://claude.ai/code/session_018E39ADWkb61Go9Et4gnBYt
</commit_message>
<xml_diff>
--- a/Exemplos/Atestado-Exemplo.docx
+++ b/Exemplos/Atestado-Exemplo.docx
@@ -29,15 +29,10 @@
         <w:t>Diagnóstico (CID): {{CID}}</w:t>
       </w:r>
     </w:p>
-    <w:p>
-      <w:r>
-        <w:t>Endereço: {{ENDERECO}}</w:t>
-      </w:r>
-    </w:p>
     <w:p/>
     <w:p>
       <w:r>
-        <w:t>São Paulo, {{DATA_EXTENSO}}.</w:t>
+        <w:t>{{CIDADE}}, {{DATA_EXTENSO}}.</w:t>
       </w:r>
     </w:p>
     <w:p/>
@@ -69,7 +64,7 @@
       <w:pStyle w:val="Header"/>
     </w:pPr>
     <w:r>
-      <w:t>Clínica Exemplo — Paciente: {{NOME_PACIENTE}}</w:t>
+      <w:t>{{LOCAL}} — {{LOCAL_ENDERECO}} — Tel. {{LOCAL_TELEFONE}}</w:t>
     </w:r>
   </w:p>
 </w:hdr>

</xml_diff>